<commit_message>
All resumes and cover letters rebuilt with the PDF text-order fix
Verified: every resume PDF now stores each bullet right after its job,
and every resume and cover letter is still one page in PDF and Word.

Co-Authored-By: Claude Opus 5.5 <noreply@anthropic.com>
Claude-Session: https://claude.ai/code/session_01VpCXqDFSAKkK8y6mKL2HCw
</commit_message>
<xml_diff>
--- a/Job Hunt 2026/2026-07-18 - Tatum Management Group - Marketing Director/Joshua_Chappell_CoverLetter_Tatum.docx
+++ b/Job Hunt 2026/2026-07-18 - Tatum Management Group - Marketing Director/Joshua_Chappell_CoverLetter_Tatum.docx
@@ -25,9 +25,9 @@
           <w:sz w:val="19"/>
           <w:szCs w:val="19"/>
         </w:rPr>
-        <w:t xml:space="preserve">Mesa, AZ  •  480-586-7959  •  </w:t>
-      </w:r>
-      <w:hyperlink w:history="1" r:id="rIdbnutvufashcpydfoazhpo">
+        <w:t xml:space="preserve">Mesa, AZ • 480-586-7959 • </w:t>
+      </w:r>
+      <w:hyperlink w:history="1" r:id="rId-j6sngh7ap_vvzpoz_vll">
         <w:r>
           <w:rPr>
             <w:rFonts w:ascii="Calibri" w:cs="Calibri" w:eastAsia="Calibri" w:hAnsi="Calibri"/>
@@ -45,9 +45,9 @@
           <w:sz w:val="19"/>
           <w:szCs w:val="19"/>
         </w:rPr>
-        <w:t xml:space="preserve">  •  </w:t>
-      </w:r>
-      <w:hyperlink w:history="1" r:id="rIdocnhuavlh23ageirwwvft">
+        <w:t xml:space="preserve"> • </w:t>
+      </w:r>
+      <w:hyperlink w:history="1" r:id="rIdujcnndd3geywqzusina7l">
         <w:r>
           <w:rPr>
             <w:rFonts w:ascii="Calibri" w:cs="Calibri" w:eastAsia="Calibri" w:hAnsi="Calibri"/>

</xml_diff>